<commit_message>
README.md updated. Need ongoing progress
</commit_message>
<xml_diff>
--- a/Mini Project 1 Description.docx
+++ b/Mini Project 1 Description.docx
@@ -375,13 +375,7 @@
         <w:rPr>
           <w:highlight w:val="yellow"/>
         </w:rPr>
-        <w:t xml:space="preserve"> </w:t>
-      </w:r>
-      <w:r>
-        <w:rPr>
-          <w:highlight w:val="yellow"/>
-        </w:rPr>
-        <w:t>Data Science Practices</w:t>
+        <w:t xml:space="preserve"> Data Science Practices</w:t>
       </w:r>
       <w:r>
         <w:rPr>
@@ -464,7 +458,15 @@
         <w:t>:</w:t>
       </w:r>
       <w:r>
-        <w:t xml:space="preserve"> to answer any business queries along side with an API to summarise the answer from the database.</w:t>
+        <w:t xml:space="preserve"> to answer any business queries </w:t>
+      </w:r>
+      <w:proofErr w:type="spellStart"/>
+      <w:r>
+        <w:t>along side</w:t>
+      </w:r>
+      <w:proofErr w:type="spellEnd"/>
+      <w:r>
+        <w:t xml:space="preserve"> with an API to summarise the answer from the database.</w:t>
       </w:r>
     </w:p>
     <w:p>
@@ -794,12 +796,21 @@
         </w:tabs>
         <w:ind w:left="360"/>
       </w:pPr>
-      <w:r>
-        <w:rPr>
-          <w:b/>
-          <w:bCs/>
-        </w:rPr>
-        <w:t>Jupyter Notebook</w:t>
+      <w:proofErr w:type="spellStart"/>
+      <w:r>
+        <w:rPr>
+          <w:b/>
+          <w:bCs/>
+        </w:rPr>
+        <w:t>Jupyter</w:t>
+      </w:r>
+      <w:proofErr w:type="spellEnd"/>
+      <w:r>
+        <w:rPr>
+          <w:b/>
+          <w:bCs/>
+        </w:rPr>
+        <w:t xml:space="preserve"> Notebook</w:t>
       </w:r>
       <w:r>
         <w:t> (For analysis in step d. and e.)</w:t>
@@ -939,7 +950,15 @@
         <w:ind w:left="360"/>
       </w:pPr>
       <w:r>
-        <w:t>Code review of jupyter notebook (2mins)</w:t>
+        <w:t xml:space="preserve">Code review of </w:t>
+      </w:r>
+      <w:proofErr w:type="spellStart"/>
+      <w:r>
+        <w:t>jupyter</w:t>
+      </w:r>
+      <w:proofErr w:type="spellEnd"/>
+      <w:r>
+        <w:t xml:space="preserve"> notebook (2mins)</w:t>
       </w:r>
     </w:p>
     <w:p>
@@ -1071,14 +1090,191 @@
       </w:r>
     </w:p>
     <w:p>
+      <w:r>
+        <w:br w:type="page"/>
+      </w:r>
+    </w:p>
+    <w:p>
+      <w:pPr>
+        <w:rPr>
+          <w:b/>
+          <w:bCs/>
+        </w:rPr>
+      </w:pPr>
+      <w:r>
+        <w:rPr>
+          <w:b/>
+          <w:bCs/>
+        </w:rPr>
+        <w:lastRenderedPageBreak/>
+        <w:t>Improvements:</w:t>
+      </w:r>
+    </w:p>
+    <w:p>
       <w:pPr>
         <w:pStyle w:val="ListParagraph"/>
         <w:numPr>
           <w:ilvl w:val="0"/>
-          <w:numId w:val="4"/>
-        </w:numPr>
-      </w:pPr>
-    </w:p>
+          <w:numId w:val="5"/>
+        </w:numPr>
+      </w:pPr>
+      <w:r>
+        <w:t>Add new markdown blocks and reference which block is in which slide (optional)</w:t>
+      </w:r>
+    </w:p>
+    <w:p>
+      <w:pPr>
+        <w:pStyle w:val="ListParagraph"/>
+        <w:numPr>
+          <w:ilvl w:val="0"/>
+          <w:numId w:val="5"/>
+        </w:numPr>
+      </w:pPr>
+      <w:r>
+        <w:t>Include hypothesis testing. Tests to see if your hypothesis is correct or not.</w:t>
+      </w:r>
+    </w:p>
+    <w:p>
+      <w:pPr>
+        <w:pStyle w:val="ListParagraph"/>
+        <w:numPr>
+          <w:ilvl w:val="0"/>
+          <w:numId w:val="5"/>
+        </w:numPr>
+      </w:pPr>
+      <w:r>
+        <w:t>Stick to 1-2 stakeholder maximum so that you can focus on their recommendations into depth.</w:t>
+      </w:r>
+    </w:p>
+    <w:p>
+      <w:pPr>
+        <w:pStyle w:val="ListParagraph"/>
+        <w:numPr>
+          <w:ilvl w:val="0"/>
+          <w:numId w:val="5"/>
+        </w:numPr>
+      </w:pPr>
+      <w:r>
+        <w:t xml:space="preserve">Problem statements are not questions. </w:t>
+      </w:r>
+    </w:p>
+    <w:p>
+      <w:pPr>
+        <w:pStyle w:val="ListParagraph"/>
+        <w:numPr>
+          <w:ilvl w:val="0"/>
+          <w:numId w:val="5"/>
+        </w:numPr>
+      </w:pPr>
+      <w:r>
+        <w:t>Why the problem is worth investigating you can add a slide to show an article that relates to this.</w:t>
+      </w:r>
+    </w:p>
+    <w:p>
+      <w:pPr>
+        <w:pStyle w:val="ListParagraph"/>
+        <w:numPr>
+          <w:ilvl w:val="0"/>
+          <w:numId w:val="5"/>
+        </w:numPr>
+      </w:pPr>
+      <w:r>
+        <w:t>Stakeholders, problem statement and key insight discovery best to put into different slides.</w:t>
+      </w:r>
+    </w:p>
+    <w:p>
+      <w:pPr>
+        <w:pStyle w:val="ListParagraph"/>
+        <w:numPr>
+          <w:ilvl w:val="0"/>
+          <w:numId w:val="5"/>
+        </w:numPr>
+      </w:pPr>
+      <w:r>
+        <w:t>Remove the data cleaning and initial dataset part. Slide 7 and 10.</w:t>
+      </w:r>
+    </w:p>
+    <w:p>
+      <w:pPr>
+        <w:pStyle w:val="ListParagraph"/>
+        <w:numPr>
+          <w:ilvl w:val="0"/>
+          <w:numId w:val="5"/>
+        </w:numPr>
+      </w:pPr>
+      <w:r>
+        <w:t xml:space="preserve">Think of having better visualisation from slide </w:t>
+      </w:r>
+      <w:r>
+        <w:t>14 instead</w:t>
+      </w:r>
+      <w:r>
+        <w:t xml:space="preserve"> of bar chart use line chart for that use case.</w:t>
+      </w:r>
+    </w:p>
+    <w:p>
+      <w:pPr>
+        <w:pStyle w:val="ListParagraph"/>
+        <w:numPr>
+          <w:ilvl w:val="0"/>
+          <w:numId w:val="5"/>
+        </w:numPr>
+      </w:pPr>
+      <w:r>
+        <w:t>Add each slide like an insight to explain what it is about.</w:t>
+      </w:r>
+    </w:p>
+    <w:p>
+      <w:pPr>
+        <w:pStyle w:val="ListParagraph"/>
+        <w:numPr>
+          <w:ilvl w:val="0"/>
+          <w:numId w:val="5"/>
+        </w:numPr>
+      </w:pPr>
+      <w:r>
+        <w:t>Try to minimize the number of words and colour to explain. Think of a better way to phrase the information somehow.</w:t>
+      </w:r>
+    </w:p>
+    <w:p>
+      <w:pPr>
+        <w:pStyle w:val="ListParagraph"/>
+        <w:numPr>
+          <w:ilvl w:val="0"/>
+          <w:numId w:val="5"/>
+        </w:numPr>
+      </w:pPr>
+      <w:r>
+        <w:t>Data improving quality is not recommendations and it you can tend to put as limitations but it not the stakeholder job.</w:t>
+      </w:r>
+    </w:p>
+    <w:p>
+      <w:pPr>
+        <w:pStyle w:val="ListParagraph"/>
+        <w:numPr>
+          <w:ilvl w:val="0"/>
+          <w:numId w:val="5"/>
+        </w:numPr>
+      </w:pPr>
+      <w:r>
+        <w:t>Don’t need a summary, you can add an appendix</w:t>
+      </w:r>
+    </w:p>
+    <w:p>
+      <w:pPr>
+        <w:pStyle w:val="ListParagraph"/>
+        <w:numPr>
+          <w:ilvl w:val="0"/>
+          <w:numId w:val="5"/>
+        </w:numPr>
+      </w:pPr>
+    </w:p>
+    <w:p>
+      <w:pPr>
+        <w:pStyle w:val="ListParagraph"/>
+      </w:pPr>
+    </w:p>
+    <w:p/>
     <w:p/>
     <w:p/>
     <w:sectPr>
@@ -1094,6 +1290,119 @@
 <file path=word/numbering.xml><?xml version="1.0" encoding="utf-8"?>
 <w:numbering xmlns:wpc="http://schemas.microsoft.com/office/word/2010/wordprocessingCanvas" xmlns:cx="http://schemas.microsoft.com/office/drawing/2014/chartex" xmlns:cx1="http://schemas.microsoft.com/office/drawing/2015/9/8/chartex" xmlns:cx2="http://schemas.microsoft.com/office/drawing/2015/10/21/chartex" xmlns:cx3="http://schemas.microsoft.com/office/drawing/2016/5/9/chartex" xmlns:cx4="http://schemas.microsoft.com/office/drawing/2016/5/10/chartex" xmlns:cx5="http://schemas.microsoft.com/office/drawing/2016/5/11/chartex" xmlns:cx6="http://schemas.microsoft.com/office/drawing/2016/5/12/chartex" xmlns:cx7="http://schemas.microsoft.com/office/drawing/2016/5/13/chartex" xmlns:cx8="http://schemas.microsoft.com/office/drawing/2016/5/14/chartex" xmlns:mc="http://schemas.openxmlformats.org/markup-compatibility/2006" xmlns:aink="http://schemas.microsoft.com/office/drawing/2016/ink" xmlns:am3d="http://schemas.microsoft.com/office/drawing/2017/model3d" xmlns:o="urn:schemas-microsoft-com:office:office" xmlns:oel="http://schemas.microsoft.com/office/2019/extlst" xmlns:r="http://schemas.openxmlformats.org/officeDocument/2006/relationships" xmlns:m="http://schemas.openxmlformats.org/officeDocument/2006/math" xmlns:v="urn:schemas-microsoft-com:vml" xmlns:wp14="http://schemas.microsoft.com/office/word/2010/wordprocessingDrawing" xmlns:wp="http://schemas.openxmlformats.org/drawingml/2006/wordprocessingDrawing" xmlns:w10="urn:schemas-microsoft-com:office:word" xmlns:w="http://schemas.openxmlformats.org/wordprocessingml/2006/main" xmlns:w14="http://schemas.microsoft.com/office/word/2010/wordml" xmlns:w15="http://schemas.microsoft.com/office/word/2012/wordml" xmlns:w16cex="http://schemas.microsoft.com/office/word/2018/wordml/cex" xmlns:w16cid="http://schemas.microsoft.com/office/word/2016/wordml/cid" xmlns:w16="http://schemas.microsoft.com/office/word/2018/wordml" xmlns:w16du="http://schemas.microsoft.com/office/word/2023/wordml/word16du" xmlns:w16sdtdh="http://schemas.microsoft.com/office/word/2020/wordml/sdtdatahash" xmlns:w16sdtfl="http://schemas.microsoft.com/office/word/2024/wordml/sdtformatlock" xmlns:w16se="http://schemas.microsoft.com/office/word/2015/wordml/symex" xmlns:wpg="http://schemas.microsoft.com/office/word/2010/wordprocessingGroup" xmlns:wpi="http://schemas.microsoft.com/office/word/2010/wordprocessingInk" xmlns:wne="http://schemas.microsoft.com/office/word/2006/wordml" xmlns:wps="http://schemas.microsoft.com/office/word/2010/wordprocessingShape" mc:Ignorable="w14 w15 w16se w16cid w16 w16cex w16sdtdh w16sdtfl w16du wp14">
   <w:abstractNum w:abstractNumId="0" w15:restartNumberingAfterBreak="0">
+    <w:nsid w:val="41E70CD6"/>
+    <w:multiLevelType w:val="hybridMultilevel"/>
+    <w:tmpl w:val="5E740578"/>
+    <w:lvl w:ilvl="0" w:tplc="0C090001">
+      <w:start w:val="1"/>
+      <w:numFmt w:val="bullet"/>
+      <w:lvlText w:val=""/>
+      <w:lvlJc w:val="left"/>
+      <w:pPr>
+        <w:ind w:left="720" w:hanging="360"/>
+      </w:pPr>
+      <w:rPr>
+        <w:rFonts w:ascii="Symbol" w:hAnsi="Symbol" w:hint="default"/>
+      </w:rPr>
+    </w:lvl>
+    <w:lvl w:ilvl="1" w:tplc="0C090003" w:tentative="1">
+      <w:start w:val="1"/>
+      <w:numFmt w:val="bullet"/>
+      <w:lvlText w:val="o"/>
+      <w:lvlJc w:val="left"/>
+      <w:pPr>
+        <w:ind w:left="1440" w:hanging="360"/>
+      </w:pPr>
+      <w:rPr>
+        <w:rFonts w:ascii="Courier New" w:hAnsi="Courier New" w:cs="Courier New" w:hint="default"/>
+      </w:rPr>
+    </w:lvl>
+    <w:lvl w:ilvl="2" w:tplc="0C090005" w:tentative="1">
+      <w:start w:val="1"/>
+      <w:numFmt w:val="bullet"/>
+      <w:lvlText w:val=""/>
+      <w:lvlJc w:val="left"/>
+      <w:pPr>
+        <w:ind w:left="2160" w:hanging="360"/>
+      </w:pPr>
+      <w:rPr>
+        <w:rFonts w:ascii="Wingdings" w:hAnsi="Wingdings" w:hint="default"/>
+      </w:rPr>
+    </w:lvl>
+    <w:lvl w:ilvl="3" w:tplc="0C090001" w:tentative="1">
+      <w:start w:val="1"/>
+      <w:numFmt w:val="bullet"/>
+      <w:lvlText w:val=""/>
+      <w:lvlJc w:val="left"/>
+      <w:pPr>
+        <w:ind w:left="2880" w:hanging="360"/>
+      </w:pPr>
+      <w:rPr>
+        <w:rFonts w:ascii="Symbol" w:hAnsi="Symbol" w:hint="default"/>
+      </w:rPr>
+    </w:lvl>
+    <w:lvl w:ilvl="4" w:tplc="0C090003" w:tentative="1">
+      <w:start w:val="1"/>
+      <w:numFmt w:val="bullet"/>
+      <w:lvlText w:val="o"/>
+      <w:lvlJc w:val="left"/>
+      <w:pPr>
+        <w:ind w:left="3600" w:hanging="360"/>
+      </w:pPr>
+      <w:rPr>
+        <w:rFonts w:ascii="Courier New" w:hAnsi="Courier New" w:cs="Courier New" w:hint="default"/>
+      </w:rPr>
+    </w:lvl>
+    <w:lvl w:ilvl="5" w:tplc="0C090005" w:tentative="1">
+      <w:start w:val="1"/>
+      <w:numFmt w:val="bullet"/>
+      <w:lvlText w:val=""/>
+      <w:lvlJc w:val="left"/>
+      <w:pPr>
+        <w:ind w:left="4320" w:hanging="360"/>
+      </w:pPr>
+      <w:rPr>
+        <w:rFonts w:ascii="Wingdings" w:hAnsi="Wingdings" w:hint="default"/>
+      </w:rPr>
+    </w:lvl>
+    <w:lvl w:ilvl="6" w:tplc="0C090001" w:tentative="1">
+      <w:start w:val="1"/>
+      <w:numFmt w:val="bullet"/>
+      <w:lvlText w:val=""/>
+      <w:lvlJc w:val="left"/>
+      <w:pPr>
+        <w:ind w:left="5040" w:hanging="360"/>
+      </w:pPr>
+      <w:rPr>
+        <w:rFonts w:ascii="Symbol" w:hAnsi="Symbol" w:hint="default"/>
+      </w:rPr>
+    </w:lvl>
+    <w:lvl w:ilvl="7" w:tplc="0C090003" w:tentative="1">
+      <w:start w:val="1"/>
+      <w:numFmt w:val="bullet"/>
+      <w:lvlText w:val="o"/>
+      <w:lvlJc w:val="left"/>
+      <w:pPr>
+        <w:ind w:left="5760" w:hanging="360"/>
+      </w:pPr>
+      <w:rPr>
+        <w:rFonts w:ascii="Courier New" w:hAnsi="Courier New" w:cs="Courier New" w:hint="default"/>
+      </w:rPr>
+    </w:lvl>
+    <w:lvl w:ilvl="8" w:tplc="0C090005" w:tentative="1">
+      <w:start w:val="1"/>
+      <w:numFmt w:val="bullet"/>
+      <w:lvlText w:val=""/>
+      <w:lvlJc w:val="left"/>
+      <w:pPr>
+        <w:ind w:left="6480" w:hanging="360"/>
+      </w:pPr>
+      <w:rPr>
+        <w:rFonts w:ascii="Wingdings" w:hAnsi="Wingdings" w:hint="default"/>
+      </w:rPr>
+    </w:lvl>
+  </w:abstractNum>
+  <w:abstractNum w:abstractNumId="1" w15:restartNumberingAfterBreak="0">
     <w:nsid w:val="58C07690"/>
     <w:multiLevelType w:val="hybridMultilevel"/>
     <w:tmpl w:val="C7F81EC4"/>
@@ -1182,7 +1491,7 @@
       </w:pPr>
     </w:lvl>
   </w:abstractNum>
-  <w:abstractNum w:abstractNumId="1" w15:restartNumberingAfterBreak="0">
+  <w:abstractNum w:abstractNumId="2" w15:restartNumberingAfterBreak="0">
     <w:nsid w:val="77985078"/>
     <w:multiLevelType w:val="multilevel"/>
     <w:tmpl w:val="1ED085C8"/>
@@ -1320,10 +1629,10 @@
     </w:lvl>
   </w:abstractNum>
   <w:num w:numId="1" w16cid:durableId="908811380">
-    <w:abstractNumId w:val="1"/>
+    <w:abstractNumId w:val="2"/>
   </w:num>
   <w:num w:numId="2" w16cid:durableId="1437091309">
-    <w:abstractNumId w:val="1"/>
+    <w:abstractNumId w:val="2"/>
     <w:lvlOverride w:ilvl="1">
       <w:lvl w:ilvl="1">
         <w:numFmt w:val="bullet"/>
@@ -1343,7 +1652,7 @@
     </w:lvlOverride>
   </w:num>
   <w:num w:numId="3" w16cid:durableId="1282300604">
-    <w:abstractNumId w:val="1"/>
+    <w:abstractNumId w:val="2"/>
     <w:lvlOverride w:ilvl="1">
       <w:lvl w:ilvl="1">
         <w:numFmt w:val="bullet"/>
@@ -1363,6 +1672,9 @@
     </w:lvlOverride>
   </w:num>
   <w:num w:numId="4" w16cid:durableId="1577086218">
+    <w:abstractNumId w:val="1"/>
+  </w:num>
+  <w:num w:numId="5" w16cid:durableId="1121073877">
     <w:abstractNumId w:val="0"/>
   </w:num>
 </w:numbering>
@@ -1971,6 +2283,7 @@
   <w:style w:type="character" w:default="1" w:styleId="DefaultParagraphFont">
     <w:name w:val="Default Paragraph Font"/>
     <w:uiPriority w:val="1"/>
+    <w:semiHidden/>
     <w:unhideWhenUsed/>
   </w:style>
   <w:style w:type="table" w:default="1" w:styleId="TableNormal">

</xml_diff>